<commit_message>
docs: Exec Summary now defines GUI/output structure (rubric requirement)
Level-1 Approach criterion explicitly requires "defining expected output format
(GUI structure)" — the summary did not mention the dashboard. Added an
Output/GUI paragraph describing the interactive multi-tab dashboard (Station
Designer live sliders + Robust-Optimiser/Uncertainty/Sensitivity tabs) and the
one-command HTML report. Also updated methodology text to reflect the coupled
LP-optimal dispatch and bootstrap confidence intervals. PDF regenerated,
confirmed still exactly 2 pages.
</commit_message>
<xml_diff>
--- a/outputs/Executive_Summary.docx
+++ b/outputs/Executive_Summary.docx
@@ -514,7 +514,7 @@
           <w:b w:val="0"/>
           <w:sz w:val="19"/>
         </w:rPr>
-        <w:t xml:space="preserve"> simulate an 8,760-hour energy balance for any design under the capped grid, dispatching PV → battery (with off-peak grid pre-charging for peak-shaving) → capped grid → unmet demand; </w:t>
+        <w:t xml:space="preserve"> simulate an 8,760-hour energy balance for any design under the capped grid (PV → battery → capped grid → unmet demand), with every reported design re-optimised under an LP-optimal rolling-horizon dispatch; </w:t>
       </w:r>
       <w:r>
         <w:rPr>
@@ -556,7 +556,7 @@
           <w:b w:val="0"/>
           <w:sz w:val="19"/>
         </w:rPr>
-        <w:t xml:space="preserve"> propagate uncertainty through a 500-sample correlated Monte-Carlo fan and rank drivers with a tornado and variance-based global (Sobol) sensitivity; </w:t>
+        <w:t xml:space="preserve"> propagate uncertainty through a 500-sample correlated Monte-Carlo fan (with bootstrap 95% confidence intervals) and rank drivers with a tornado and global Sobol sensitivity; </w:t>
       </w:r>
       <w:r>
         <w:rPr>
@@ -570,7 +570,21 @@
           <w:b w:val="0"/>
           <w:sz w:val="19"/>
         </w:rPr>
-        <w:t xml:space="preserve"> confirm the conclusion is not an artefact via a robustness-of-robustness sweep (it holds across every penalty x grid combination) and validate seven outputs against published benchmarks. The full study runs in under a minute.</w:t>
+        <w:t xml:space="preserve"> confirm the conclusion via a robustness-of-robustness sweep (it holds across every penalty x grid combination) and validate seven outputs against published benchmarks. </w:t>
+      </w:r>
+      <w:r>
+        <w:rPr>
+          <w:b/>
+          <w:sz w:val="19"/>
+        </w:rPr>
+        <w:t>Output / GUI:</w:t>
+      </w:r>
+      <w:r>
+        <w:rPr>
+          <w:b w:val="0"/>
+          <w:sz w:val="19"/>
+        </w:rPr>
+        <w:t xml:space="preserve"> results are delivered as an interactive multi-tab dashboard — a Station Designer with live PV/battery/charger/grid sliders showing energy balance, service, cost and carbon in real time, plus Robust-Optimiser, Uncertainty and Sensitivity tabs — and a one-command HTML report. The full study runs in under a minute.</w:t>
       </w:r>
     </w:p>
     <w:p>

</xml_diff>

<commit_message>
Executive Summary: compact to a true 2-page A4 layout
Tighten spacing, shrink the schematic, and use a single Pareto+Robustness
figure pair (drop the 4th figure) so the report fits 2 A4 pages as the official
template requires, while keeping Approach (278/300) + Outcomes (414/500),
the schematic, key visualisations, GitHub links and references.
</commit_message>
<xml_diff>
--- a/outputs/Executive_Summary.docx
+++ b/outputs/Executive_Summary.docx
@@ -4,7 +4,7 @@
   <w:body>
     <w:p>
       <w:pPr>
-        <w:spacing w:before="0" w:after="40" w:line="250" w:lineRule="auto"/>
+        <w:spacing w:before="0" w:after="40" w:line="240" w:lineRule="auto"/>
       </w:pPr>
       <w:r>
         <w:rPr>
@@ -19,7 +19,7 @@
     </w:p>
     <w:p>
       <w:pPr>
-        <w:spacing w:before="0" w:after="20" w:line="250" w:lineRule="auto"/>
+        <w:spacing w:before="0" w:after="20" w:line="240" w:lineRule="auto"/>
       </w:pPr>
       <w:r>
         <w:rPr>
@@ -34,7 +34,7 @@
     </w:p>
     <w:p>
       <w:pPr>
-        <w:spacing w:before="0" w:after="120" w:line="250" w:lineRule="auto"/>
+        <w:spacing w:before="0" w:after="80" w:line="240" w:lineRule="auto"/>
       </w:pPr>
       <w:r>
         <w:rPr>
@@ -49,7 +49,7 @@
     </w:p>
     <w:p>
       <w:pPr>
-        <w:spacing w:before="120" w:after="40" w:line="250" w:lineRule="auto"/>
+        <w:spacing w:before="80" w:after="20" w:line="240" w:lineRule="auto"/>
         <w:pBdr>
           <w:bottom w:val="single" w:sz="6" w:space="2" w:color="C7D3DC"/>
         </w:pBdr>
@@ -67,7 +67,7 @@
     </w:p>
     <w:p>
       <w:pPr>
-        <w:spacing w:before="0" w:after="80" w:line="250" w:lineRule="auto"/>
+        <w:spacing w:before="0" w:after="40" w:line="240" w:lineRule="auto"/>
         <w:jc w:val="both"/>
       </w:pPr>
       <w:r>
@@ -91,7 +91,7 @@
     </w:p>
     <w:p>
       <w:pPr>
-        <w:spacing w:before="0" w:after="80" w:line="250" w:lineRule="auto"/>
+        <w:spacing w:before="0" w:after="40" w:line="240" w:lineRule="auto"/>
         <w:jc w:val="both"/>
       </w:pPr>
       <w:r>
@@ -115,7 +115,7 @@
     </w:p>
     <w:p>
       <w:pPr>
-        <w:spacing w:before="0" w:after="80" w:line="250" w:lineRule="auto"/>
+        <w:spacing w:before="0" w:after="40" w:line="240" w:lineRule="auto"/>
         <w:jc w:val="both"/>
       </w:pPr>
       <w:r>
@@ -139,7 +139,7 @@
     </w:p>
     <w:p>
       <w:pPr>
-        <w:spacing w:before="0" w:after="80" w:line="250" w:lineRule="auto"/>
+        <w:spacing w:before="0" w:after="40" w:line="240" w:lineRule="auto"/>
         <w:jc w:val="both"/>
       </w:pPr>
       <w:r>
@@ -168,7 +168,7 @@
       <w:r>
         <w:drawing>
           <wp:inline xmlns:a="http://schemas.openxmlformats.org/drawingml/2006/main" xmlns:pic="http://schemas.openxmlformats.org/drawingml/2006/picture">
-            <wp:extent cx="4754880" cy="3547767"/>
+            <wp:extent cx="3657600" cy="2729052"/>
             <wp:docPr id="1" name="Picture 1"/>
             <wp:cNvGraphicFramePr>
               <a:graphicFrameLocks noChangeAspect="1"/>
@@ -189,7 +189,7 @@
                   <pic:spPr>
                     <a:xfrm>
                       <a:off x="0" y="0"/>
-                      <a:ext cx="4754880" cy="3547767"/>
+                      <a:ext cx="3657600" cy="2729052"/>
                     </a:xfrm>
                     <a:prstGeom prst="rect"/>
                   </pic:spPr>
@@ -202,7 +202,7 @@
     </w:p>
     <w:p>
       <w:pPr>
-        <w:spacing w:before="0" w:after="120" w:line="250" w:lineRule="auto"/>
+        <w:spacing w:before="0" w:after="60" w:line="240" w:lineRule="auto"/>
         <w:jc w:val="center"/>
       </w:pPr>
       <w:r>
@@ -218,7 +218,7 @@
     </w:p>
     <w:p>
       <w:pPr>
-        <w:spacing w:before="120" w:after="40" w:line="250" w:lineRule="auto"/>
+        <w:spacing w:before="80" w:after="20" w:line="240" w:lineRule="auto"/>
         <w:pBdr>
           <w:bottom w:val="single" w:sz="6" w:space="2" w:color="C7D3DC"/>
         </w:pBdr>
@@ -236,7 +236,7 @@
     </w:p>
     <w:p>
       <w:pPr>
-        <w:spacing w:before="0" w:after="80" w:line="250" w:lineRule="auto"/>
+        <w:spacing w:before="0" w:after="40" w:line="240" w:lineRule="auto"/>
         <w:jc w:val="both"/>
       </w:pPr>
       <w:r>
@@ -260,7 +260,7 @@
     </w:p>
     <w:p>
       <w:pPr>
-        <w:spacing w:before="0" w:after="80" w:line="250" w:lineRule="auto"/>
+        <w:spacing w:before="0" w:after="40" w:line="240" w:lineRule="auto"/>
         <w:jc w:val="both"/>
       </w:pPr>
       <w:r>
@@ -284,7 +284,7 @@
     </w:p>
     <w:p>
       <w:pPr>
-        <w:spacing w:before="0" w:after="80" w:line="250" w:lineRule="auto"/>
+        <w:spacing w:before="0" w:after="40" w:line="240" w:lineRule="auto"/>
         <w:jc w:val="both"/>
       </w:pPr>
       <w:r>
@@ -308,7 +308,7 @@
     </w:p>
     <w:p>
       <w:pPr>
-        <w:spacing w:before="0" w:after="80" w:line="250" w:lineRule="auto"/>
+        <w:spacing w:before="0" w:after="40" w:line="240" w:lineRule="auto"/>
         <w:jc w:val="both"/>
       </w:pPr>
       <w:r>
@@ -332,7 +332,7 @@
     </w:p>
     <w:p>
       <w:pPr>
-        <w:spacing w:before="0" w:after="80" w:line="250" w:lineRule="auto"/>
+        <w:spacing w:before="0" w:after="40" w:line="240" w:lineRule="auto"/>
         <w:jc w:val="both"/>
       </w:pPr>
       <w:r>
@@ -356,7 +356,7 @@
     </w:p>
     <w:p>
       <w:pPr>
-        <w:spacing w:before="0" w:after="80" w:line="250" w:lineRule="auto"/>
+        <w:spacing w:before="0" w:after="40" w:line="240" w:lineRule="auto"/>
         <w:jc w:val="both"/>
       </w:pPr>
       <w:r>
@@ -380,7 +380,7 @@
     </w:p>
     <w:p>
       <w:pPr>
-        <w:spacing w:before="0" w:after="80" w:line="250" w:lineRule="auto"/>
+        <w:spacing w:before="0" w:after="40" w:line="240" w:lineRule="auto"/>
         <w:jc w:val="both"/>
       </w:pPr>
       <w:r>
@@ -400,61 +400,6 @@
           <w:sz w:val="22"/>
         </w:rPr>
         <w:t>All model code — the dispatch engine, five-rule optimisation, Sobol and robustness analyses and every figure — was written from scratch for this submission. Every numerical assumption carries an inline source; the pipeline is deterministic, regenerates all data and figures from one command, and passes an automated test suite, so any reviewer can reproduce every number.</w:t>
-      </w:r>
-    </w:p>
-    <w:p>
-      <w:pPr>
-        <w:jc w:val="center"/>
-      </w:pPr>
-      <w:r>
-        <w:drawing>
-          <wp:inline xmlns:a="http://schemas.openxmlformats.org/drawingml/2006/main" xmlns:pic="http://schemas.openxmlformats.org/drawingml/2006/picture">
-            <wp:extent cx="4023360" cy="2048256"/>
-            <wp:docPr id="2" name="Picture 2"/>
-            <wp:cNvGraphicFramePr>
-              <a:graphicFrameLocks noChangeAspect="1"/>
-            </wp:cNvGraphicFramePr>
-            <a:graphic>
-              <a:graphicData uri="http://schemas.openxmlformats.org/drawingml/2006/picture">
-                <pic:pic>
-                  <pic:nvPicPr>
-                    <pic:cNvPr id="0" name="02_pareto.png"/>
-                    <pic:cNvPicPr/>
-                  </pic:nvPicPr>
-                  <pic:blipFill>
-                    <a:blip r:embed="rId10"/>
-                    <a:stretch>
-                      <a:fillRect/>
-                    </a:stretch>
-                  </pic:blipFill>
-                  <pic:spPr>
-                    <a:xfrm>
-                      <a:off x="0" y="0"/>
-                      <a:ext cx="4023360" cy="2048256"/>
-                    </a:xfrm>
-                    <a:prstGeom prst="rect"/>
-                  </pic:spPr>
-                </pic:pic>
-              </a:graphicData>
-            </a:graphic>
-          </wp:inline>
-        </w:drawing>
-      </w:r>
-    </w:p>
-    <w:p>
-      <w:pPr>
-        <w:spacing w:before="0" w:after="80" w:line="250" w:lineRule="auto"/>
-        <w:jc w:val="center"/>
-      </w:pPr>
-      <w:r>
-        <w:rPr>
-          <w:rFonts w:ascii="Aptos" w:hAnsi="Aptos" w:cs="Aptos"/>
-          <w:b w:val="0"/>
-          <w:i/>
-          <w:color w:val="555560"/>
-          <w:sz w:val="17"/>
-        </w:rPr>
-        <w:t>Figure 2 — Cost-vs-robustness Pareto frontier (five decision rules).</w:t>
       </w:r>
     </w:p>
     <w:tbl>
@@ -478,7 +423,7 @@
       <w:tr>
         <w:tc>
           <w:tcPr>
-            <w:tcW w:type="dxa" w:w="4082"/>
+            <w:tcW w:type="dxa" w:w="4535"/>
           </w:tcPr>
           <w:p>
             <w:pPr>
@@ -487,7 +432,51 @@
             <w:r>
               <w:drawing>
                 <wp:inline xmlns:a="http://schemas.openxmlformats.org/drawingml/2006/main" xmlns:pic="http://schemas.openxmlformats.org/drawingml/2006/picture">
-                  <wp:extent cx="2286000" cy="872836"/>
+                  <wp:extent cx="2514600" cy="1280160"/>
+                  <wp:docPr id="2" name="Picture 2"/>
+                  <wp:cNvGraphicFramePr>
+                    <a:graphicFrameLocks noChangeAspect="1"/>
+                  </wp:cNvGraphicFramePr>
+                  <a:graphic>
+                    <a:graphicData uri="http://schemas.openxmlformats.org/drawingml/2006/picture">
+                      <pic:pic>
+                        <pic:nvPicPr>
+                          <pic:cNvPr id="0" name="02_pareto.png"/>
+                          <pic:cNvPicPr/>
+                        </pic:nvPicPr>
+                        <pic:blipFill>
+                          <a:blip r:embed="rId10"/>
+                          <a:stretch>
+                            <a:fillRect/>
+                          </a:stretch>
+                        </pic:blipFill>
+                        <pic:spPr>
+                          <a:xfrm>
+                            <a:off x="0" y="0"/>
+                            <a:ext cx="2514600" cy="1280160"/>
+                          </a:xfrm>
+                          <a:prstGeom prst="rect"/>
+                        </pic:spPr>
+                      </pic:pic>
+                    </a:graphicData>
+                  </a:graphic>
+                </wp:inline>
+              </w:drawing>
+            </w:r>
+          </w:p>
+        </w:tc>
+        <w:tc>
+          <w:tcPr>
+            <w:tcW w:type="dxa" w:w="4535"/>
+          </w:tcPr>
+          <w:p>
+            <w:pPr>
+              <w:jc w:val="center"/>
+            </w:pPr>
+            <w:r>
+              <w:drawing>
+                <wp:inline xmlns:a="http://schemas.openxmlformats.org/drawingml/2006/main" xmlns:pic="http://schemas.openxmlformats.org/drawingml/2006/picture">
+                  <wp:extent cx="2514600" cy="960120"/>
                   <wp:docPr id="3" name="Picture 3"/>
                   <wp:cNvGraphicFramePr>
                     <a:graphicFrameLocks noChangeAspect="1"/>
@@ -508,51 +497,7 @@
                         <pic:spPr>
                           <a:xfrm>
                             <a:off x="0" y="0"/>
-                            <a:ext cx="2286000" cy="872836"/>
-                          </a:xfrm>
-                          <a:prstGeom prst="rect"/>
-                        </pic:spPr>
-                      </pic:pic>
-                    </a:graphicData>
-                  </a:graphic>
-                </wp:inline>
-              </w:drawing>
-            </w:r>
-          </w:p>
-        </w:tc>
-        <w:tc>
-          <w:tcPr>
-            <w:tcW w:type="dxa" w:w="4082"/>
-          </w:tcPr>
-          <w:p>
-            <w:pPr>
-              <w:jc w:val="center"/>
-            </w:pPr>
-            <w:r>
-              <w:drawing>
-                <wp:inline xmlns:a="http://schemas.openxmlformats.org/drawingml/2006/main" xmlns:pic="http://schemas.openxmlformats.org/drawingml/2006/picture">
-                  <wp:extent cx="2286000" cy="893618"/>
-                  <wp:docPr id="4" name="Picture 4"/>
-                  <wp:cNvGraphicFramePr>
-                    <a:graphicFrameLocks noChangeAspect="1"/>
-                  </wp:cNvGraphicFramePr>
-                  <a:graphic>
-                    <a:graphicData uri="http://schemas.openxmlformats.org/drawingml/2006/picture">
-                      <pic:pic>
-                        <pic:nvPicPr>
-                          <pic:cNvPr id="0" name="11_validation.png"/>
-                          <pic:cNvPicPr/>
-                        </pic:nvPicPr>
-                        <pic:blipFill>
-                          <a:blip r:embed="rId12"/>
-                          <a:stretch>
-                            <a:fillRect/>
-                          </a:stretch>
-                        </pic:blipFill>
-                        <pic:spPr>
-                          <a:xfrm>
-                            <a:off x="0" y="0"/>
-                            <a:ext cx="2286000" cy="893618"/>
+                            <a:ext cx="2514600" cy="960120"/>
                           </a:xfrm>
                           <a:prstGeom prst="rect"/>
                         </pic:spPr>
@@ -568,7 +513,7 @@
     </w:tbl>
     <w:p>
       <w:pPr>
-        <w:spacing w:before="0" w:after="120" w:line="250" w:lineRule="auto"/>
+        <w:spacing w:before="0" w:after="60" w:line="240" w:lineRule="auto"/>
         <w:jc w:val="center"/>
       </w:pPr>
       <w:r>
@@ -579,12 +524,12 @@
           <w:color w:val="555560"/>
           <w:sz w:val="17"/>
         </w:rPr>
-        <w:t>Figure 3 — Robust beats naive across every penalty × grid case.   Figure 4 — Validation vs published benchmarks.</w:t>
+        <w:t>Figure 2 — Cost-vs-robustness Pareto frontier (five rules).   Figure 3 — Robust beats naive across every penalty × grid case (7/7 benchmarks validated).</w:t>
       </w:r>
     </w:p>
     <w:p>
       <w:pPr>
-        <w:spacing w:before="120" w:after="40" w:line="250" w:lineRule="auto"/>
+        <w:spacing w:before="80" w:after="20" w:line="240" w:lineRule="auto"/>
         <w:pBdr>
           <w:bottom w:val="single" w:sz="6" w:space="2" w:color="C7D3DC"/>
         </w:pBdr>
@@ -602,7 +547,7 @@
     </w:p>
     <w:p>
       <w:pPr>
-        <w:spacing w:before="0" w:after="80" w:line="250" w:lineRule="auto"/>
+        <w:spacing w:before="0" w:after="80" w:line="240" w:lineRule="auto"/>
       </w:pPr>
       <w:r>
         <w:rPr>
@@ -616,7 +561,7 @@
     </w:p>
     <w:p>
       <w:pPr>
-        <w:spacing w:before="120" w:after="40" w:line="250" w:lineRule="auto"/>
+        <w:spacing w:before="80" w:after="20" w:line="240" w:lineRule="auto"/>
         <w:pBdr>
           <w:bottom w:val="single" w:sz="6" w:space="2" w:color="C7D3DC"/>
         </w:pBdr>
@@ -634,7 +579,7 @@
     </w:p>
     <w:p>
       <w:pPr>
-        <w:spacing w:before="0" w:after="40" w:line="240" w:lineRule="auto"/>
+        <w:spacing w:before="0" w:after="20" w:line="240" w:lineRule="auto"/>
       </w:pPr>
       <w:r>
         <w:rPr>
@@ -642,14 +587,14 @@
           <w:b w:val="0"/>
           <w:i w:val="0"/>
           <w:color w:val="555560"/>
-          <w:sz w:val="17"/>
+          <w:sz w:val="15"/>
         </w:rPr>
         <w:t>[1] Burani, E., Cabri, G., Leoncini, M. (2022). An Algorithm to Predict E-Bike Power Consumption Based on Planned Routes. Electronics, 11(7), 1105.</w:t>
       </w:r>
     </w:p>
     <w:p>
       <w:pPr>
-        <w:spacing w:before="0" w:after="40" w:line="240" w:lineRule="auto"/>
+        <w:spacing w:before="0" w:after="20" w:line="240" w:lineRule="auto"/>
       </w:pPr>
       <w:r>
         <w:rPr>
@@ -657,14 +602,14 @@
           <w:b w:val="0"/>
           <w:i w:val="0"/>
           <w:color w:val="555560"/>
-          <w:sz w:val="17"/>
+          <w:sz w:val="15"/>
         </w:rPr>
         <w:t>[2] Ouf, K., Soubra, H., Mazhr, A. (2023). E-Bike Energy Needs Estimation based on Route Characteristics and Rider Behavior. IEEE ICICIS 2023, 345–352.</w:t>
       </w:r>
     </w:p>
     <w:p>
       <w:pPr>
-        <w:spacing w:before="0" w:after="40" w:line="240" w:lineRule="auto"/>
+        <w:spacing w:before="0" w:after="20" w:line="240" w:lineRule="auto"/>
       </w:pPr>
       <w:r>
         <w:rPr>
@@ -672,14 +617,14 @@
           <w:b w:val="0"/>
           <w:i w:val="0"/>
           <w:color w:val="555560"/>
-          <w:sz w:val="17"/>
+          <w:sz w:val="15"/>
         </w:rPr>
         <w:t>[3] Corti, F. et al. (2024). A comprehensive review of charging infrastructure for Electric Micromobility Vehicles. Energy Reports, 12, 545–567.</w:t>
       </w:r>
     </w:p>
     <w:p>
       <w:pPr>
-        <w:spacing w:before="0" w:after="40" w:line="240" w:lineRule="auto"/>
+        <w:spacing w:before="0" w:after="20" w:line="240" w:lineRule="auto"/>
       </w:pPr>
       <w:r>
         <w:rPr>
@@ -687,14 +632,14 @@
           <w:b w:val="0"/>
           <w:i w:val="0"/>
           <w:color w:val="555560"/>
-          <w:sz w:val="17"/>
+          <w:sz w:val="15"/>
         </w:rPr>
         <w:t>[4] Marie, J.-J. (2023). The Micromobility Revolution Gathers Momentum. Faraday Insights, Issue 16.</w:t>
       </w:r>
     </w:p>
     <w:p>
       <w:pPr>
-        <w:spacing w:before="0" w:after="40" w:line="240" w:lineRule="auto"/>
+        <w:spacing w:before="0" w:after="20" w:line="240" w:lineRule="auto"/>
       </w:pPr>
       <w:r>
         <w:rPr>
@@ -702,14 +647,14 @@
           <w:b w:val="0"/>
           <w:i w:val="0"/>
           <w:color w:val="555560"/>
-          <w:sz w:val="17"/>
+          <w:sz w:val="15"/>
         </w:rPr>
         <w:t>[5] Gössling, S. (2020). Integrating e-scooters in urban transportation. Transportation Research Part D, 79, 102230.</w:t>
       </w:r>
     </w:p>
     <w:p>
       <w:pPr>
-        <w:spacing w:before="0" w:after="40" w:line="240" w:lineRule="auto"/>
+        <w:spacing w:before="0" w:after="20" w:line="240" w:lineRule="auto"/>
       </w:pPr>
       <w:r>
         <w:rPr>
@@ -717,14 +662,14 @@
           <w:b w:val="0"/>
           <w:i w:val="0"/>
           <w:color w:val="555560"/>
-          <w:sz w:val="17"/>
+          <w:sz w:val="15"/>
         </w:rPr>
         <w:t>[6] Rockafellar, R.T., Uryasev, S. (2000). Optimization of Conditional Value-at-Risk. Journal of Risk, 2(3), 21–41.</w:t>
       </w:r>
     </w:p>
     <w:p>
       <w:pPr>
-        <w:spacing w:before="0" w:after="40" w:line="240" w:lineRule="auto"/>
+        <w:spacing w:before="0" w:after="20" w:line="240" w:lineRule="auto"/>
       </w:pPr>
       <w:r>
         <w:rPr>
@@ -732,14 +677,14 @@
           <w:b w:val="0"/>
           <w:i w:val="0"/>
           <w:color w:val="555560"/>
-          <w:sz w:val="17"/>
+          <w:sz w:val="15"/>
         </w:rPr>
         <w:t>[7] Birge, J.R., Louveaux, F. (2011). Introduction to Stochastic Programming, 2nd ed. Springer.</w:t>
       </w:r>
     </w:p>
     <w:p>
       <w:pPr>
-        <w:spacing w:before="0" w:after="40" w:line="240" w:lineRule="auto"/>
+        <w:spacing w:before="0" w:after="20" w:line="240" w:lineRule="auto"/>
       </w:pPr>
       <w:r>
         <w:rPr>
@@ -747,14 +692,14 @@
           <w:b w:val="0"/>
           <w:i w:val="0"/>
           <w:color w:val="555560"/>
-          <w:sz w:val="17"/>
+          <w:sz w:val="15"/>
         </w:rPr>
         <w:t>[8] PVGIS (EU JRC) hourly series, University of Warwick (52.3838, −1.5616); National Grid ESO Carbon Intensity API, West Midlands (region 8).</w:t>
       </w:r>
     </w:p>
     <w:p>
       <w:pPr>
-        <w:spacing w:before="0" w:after="40" w:line="240" w:lineRule="auto"/>
+        <w:spacing w:before="0" w:after="20" w:line="240" w:lineRule="auto"/>
       </w:pPr>
       <w:r>
         <w:rPr>
@@ -762,7 +707,7 @@
           <w:b w:val="0"/>
           <w:i w:val="0"/>
           <w:color w:val="555560"/>
-          <w:sz w:val="17"/>
+          <w:sz w:val="15"/>
         </w:rPr>
         <w:t>[9] Cost &amp; performance benchmarks: BEIS, IRENA, BloombergNEF, IEA PVPS, Fraunhofer ISE — see REFERENCES.md.</w:t>
       </w:r>

</xml_diff>